<commit_message>
Deine Reaktion gehört dir: Dopplungen gestrafft, Lektorats-Befund
Nervensystem-Alarm-Erklaerung lief fast wortgleich in Kapitel 1/2/10/14/19c,
auf Kapitel 1 konzentriert, Rest auf Kurzverweis gekuerzt. "X ist nicht Y"-
Formel (6x) und TikTok-Merksaetze im selben Muster sprachlich variiert.
Inhaltsverzeichnis-Reihenfolge 17b/18 korrigiert (stand vor Kapitel 18 im
Verzeichnis, im Text aber danach). Kernstellen (Reaktionsuebernahme-Konzept,
Zwischenspiele Sabine/Paul, Kap. 3b/11b/17b/18b) unangetastet.

buch-pruefen.py: keine neuen Befunde. Seiten 102 -> 101.

Co-Authored-By: Claude Sonnet 5 <noreply@anthropic.com>
Claude-Session: https://claude.ai/code/session_011oFtWvyjvkDdc6K2GcSXHx
</commit_message>
<xml_diff>
--- a/outputs/buch-reaktion/buch5-MANUSKRIPT.docx
+++ b/outputs/buch-reaktion/buch5-MANUSKRIPT.docx
@@ -363,16 +363,16 @@
           <w:i w:val="0"/>
           <w:sz w:val="21"/>
         </w:rPr>
+        <w:t>18. Was du deinen eigenen Kindern stattdessen mitgeben willst</w:t>
+      </w:r>
+    </w:p>
+    <w:p>
+      <w:r>
+        <w:rPr>
+          <w:i w:val="0"/>
+          <w:sz w:val="21"/>
+        </w:rPr>
         <w:t>17b. Wenn du merkst, dass du das Muster selbst weitergegeben hast</w:t>
-      </w:r>
-    </w:p>
-    <w:p>
-      <w:r>
-        <w:rPr>
-          <w:i w:val="0"/>
-          <w:sz w:val="21"/>
-        </w:rPr>
-        <w:t>18. Was du deinen eigenen Kindern stattdessen mitgeben willst</w:t>
       </w:r>
     </w:p>
     <w:p>
@@ -1038,7 +1038,7 @@
           <w:i w:val="0"/>
           <w:sz w:val="21"/>
         </w:rPr>
-        <w:t>Sie entwickelt sich, wenn ein Kind über längere Zeit in einer Umgebung lebt, in der es nützlich war, jede kleine Veränderung sofort zu bemerken, weil die grossen Veränderungen oft ohne Vorwarnung kamen. Das Nervensystem passt sich an diese Notwendigkeit an, so wie sich ein Muskel an regelmässiges Training anpasst.</w:t>
+        <w:t>Sie entsteht aus demselben Alarmmechanismus des Nervensystems, der bereits in Kapitel 1 beschrieben wurde, nur dass hier nicht eine bestimmte Stille, sondern jede kleinste Veränderung im Umfeld zum Auslöser wird.</w:t>
       </w:r>
     </w:p>
     <w:p>
@@ -1353,7 +1353,7 @@
           <w:i w:val="0"/>
           <w:sz w:val="21"/>
         </w:rPr>
-        <w:t>Empathie heisst: Ich merke, was du fühlst, und bleibe trotzdem ich. Verschmelzung heisst: Dein Gefühl wird augenblicklich zu meinem, ohne dass ich noch unterscheiden kann, wo du aufhörst und ich anfange.</w:t>
+        <w:t>Ob du merkst, was die andere Person fühlt, und dabei trotzdem du bleibst, oder ob ihr Gefühl augenblicklich zu deinem eigenen wird, bis du nicht mehr unterscheiden kannst, wo sie aufhört und du anfängst: Genau das unterscheidet Empathie von Verschmelzung.</w:t>
       </w:r>
     </w:p>
     <w:p>
@@ -1493,7 +1493,7 @@
           <w:i w:val="0"/>
           <w:sz w:val="21"/>
         </w:rPr>
-        <w:t>Kontrolle und Fürsorge fühlen sich von innen fast identisch an, weil beide aus echter Sorge um einen anderen Menschen entstehen. Der Unterschied zeigt sich erst am Ziel: Fürsorge lässt Raum für einen anderen Ausgang. Kontrolle versucht, genau einen bestimmten Ausgang sicherzustellen.</w:t>
+        <w:t>Kontrolle und Fürsorge fühlen sich von innen fast identisch an, weil beide aus echter Sorge um einen anderen Menschen entstehen. Der Unterschied zeigt sich erst am Ziel, und zwar an einer einfachen Frage: Lässt du Raum für einen anderen Ausgang, oder sorgst du dafür, dass nur ein einziger Ausgang möglich bleibt?</w:t>
       </w:r>
     </w:p>
     <w:p>
@@ -1790,7 +1790,7 @@
           <w:i w:val="0"/>
           <w:sz w:val="21"/>
         </w:rPr>
-        <w:t>Schuld sagt: Ich habe etwas falsch gemacht. Scham sagt: Mit mir stimmt etwas nicht. Der zweite Satz ist der gefährlichere, weil er sich nicht auf eine Handlung bezieht, sondern auf die ganze Person.</w:t>
+        <w:t>Der Unterschied zeigt sich in der inneren Stimme danach: „Ich habe etwas falsch gemacht“ ist Schuld. „Mit mir stimmt etwas nicht“ ist Scham, und dieser zweite Satz ist der gefährlichere, weil er sich nicht auf eine Handlung bezieht, sondern auf die ganze Person.</w:t>
       </w:r>
     </w:p>
     <w:p>
@@ -1986,7 +1986,7 @@
           <w:i/>
           <w:sz w:val="21"/>
         </w:rPr>
-        <w:t>TikTok  ·  Seine Erwartung. Nicht deine Schuld.</w:t>
+        <w:t>TikTok  ·  Wessen Erwartung trägst du gerade, als wäre sie deine Schuld?</w:t>
       </w:r>
     </w:p>
     <w:p>
@@ -2223,7 +2223,7 @@
           <w:i/>
           <w:sz w:val="21"/>
         </w:rPr>
-        <w:t>TikTok  ·  Sein Tag. Nicht deiner.</w:t>
+        <w:t>TikTok  ·  Lass ihm seinen Tag. Deiner gehört dir.</w:t>
       </w:r>
     </w:p>
     <w:p>
@@ -2291,16 +2291,7 @@
           <w:i w:val="0"/>
           <w:sz w:val="21"/>
         </w:rPr>
-        <w:t>Wut ist unter allen Emotionen diejenige, die im Körper am stärksten Alarmreaktionen auslöst, weil sie evolutionär eng mit tatsächlicher Gefahr verbunden ist. Ein Nervensystem, das gelernt hat, fremde Wut als persönliche Gefahr einzustufen, reagiert entsprechend heftig, selbst wenn die reale Gefahr längst nicht mehr besteht.</w:t>
-      </w:r>
-    </w:p>
-    <w:p>
-      <w:r>
-        <w:rPr>
-          <w:i w:val="0"/>
-          <w:sz w:val="21"/>
-        </w:rPr>
-        <w:t>Wenn Wut in der Kindheit regelmässig mit Bestrafung, Liebesentzug oder Unberechenbarkeit verbunden war, bleibt diese Verknüpfung oft jahrzehntelang bestehen, selbst wenn die aktuelle wütende Person, ein Chef, ein Partner, ein Freund, überhaupt keine Bedrohung darstellt.</w:t>
+        <w:t>Dieser Alarm folgt demselben Mechanismus, der in Kapitel 1 beschrieben wurde: Ein Nervensystem, das früh gelernt hat, ein bestimmtes Signal als Gefahr zu lesen, reagiert auch heute noch heftig darauf. Bei Wut kommt hinzu, dass sie evolutionär besonders eng mit echter Gefahr verknüpft ist und in der Kindheit oft tatsächlich mit Bestrafung, Liebesentzug oder Unberechenbarkeit einherging.</w:t>
       </w:r>
     </w:p>
     <w:p>
@@ -2337,7 +2328,7 @@
           <w:i/>
           <w:sz w:val="21"/>
         </w:rPr>
-        <w:t>TikTok  ·  Seine Wut. Nicht dein Urteil.</w:t>
+        <w:t>TikTok  ·  Dass er wütend ist, ist sein Zustand, nicht automatisch ein Urteil über dich.</w:t>
       </w:r>
     </w:p>
     <w:p>
@@ -2806,7 +2797,7 @@
           <w:i w:val="0"/>
           <w:sz w:val="21"/>
         </w:rPr>
-        <w:t>Das Gegenteil ist der Fall. Loslassen heisst nicht, aufzuhören, jemanden zu lieben. Es heisst, aufzuhören, seine Gefühle zu deinem persönlichen Projekt zu machen.</w:t>
+        <w:t>Das Gegenteil ist der Fall: Du hörst beim Loslassen nicht auf, einen Menschen zu lieben, sondern hörst auf, seine Gefühle zu deinem persönlichen Projekt zu machen.</w:t>
       </w:r>
     </w:p>
     <w:p>
@@ -3157,16 +3148,7 @@
           <w:i w:val="0"/>
           <w:sz w:val="21"/>
         </w:rPr>
-        <w:t>Gesichtsausdrücke werden von unserem Gehirn extrem schnell und weitgehend unbewusst verarbeitet, noch bevor eine bewusste Bewertung stattfindet. Bei Menschen mit einer Geschichte emotional unberechenbarer Bezugspersonen ist diese Verarbeitung besonders empfindlich eingestellt.</w:t>
-      </w:r>
-    </w:p>
-    <w:p>
-      <w:r>
-        <w:rPr>
-          <w:i w:val="0"/>
-          <w:sz w:val="21"/>
-        </w:rPr>
-        <w:t>Ein bestimmter Gesichtsausdruck kann so zu einem regelrechten Auslöser werden, der eine körperliche Reaktion in Gang setzt, lange bevor der Verstand die Situation überhaupt eingeordnet hat. Das erklärt, warum manche Reaktionen sich so unverhältnismässig stark anfühlen im Vergleich zum tatsächlichen Anlass.</w:t>
+        <w:t>Dieser Alarm folgt demselben Mechanismus, der in Kapitel 1 beschrieben wurde: ein früh sensibilisiertes Nervensystem reagiert, bevor der Verstand die Situation einordnen kann. Bei einem enttäuschten Gesicht entsteht so eine besonders schnelle Verknüpfung, weil unser Gehirn Gesichtsausdrücke noch unbewusster verarbeitet als andere Signale.</w:t>
       </w:r>
     </w:p>
     <w:p>
@@ -4414,7 +4396,7 @@
           <w:i w:val="0"/>
           <w:sz w:val="21"/>
         </w:rPr>
-        <w:t>Tief verankerte Schutzmuster sitzen in älteren, schnelleren Teilen des Nervensystems als der bewusste Wille. Der Wille kann kurzfristig gegen ein solches Muster ansteuern, verliert aber fast immer, sobald echter Stress hinzukommt.</w:t>
+        <w:t>Das liegt am selben Mechanismus, der in Kapitel 1 beschrieben wurde: Schutzmuster sitzen in älteren, schnelleren Teilen des Nervensystems als der bewusste Wille, der gegen sie fast immer verliert, sobald echter Stress hinzukommt.</w:t>
       </w:r>
     </w:p>
     <w:p>

</xml_diff>